<commit_message>
feat: harden LegalMCQ evaluation safeguards
</commit_message>
<xml_diff>
--- a/docs/LGAgent全面优化与法律推理增强技术报告_20260912.docx
+++ b/docs/LGAgent全面优化与法律推理增强技术报告_20260912.docx
@@ -30,19 +30,17 @@
           <w:spacing w:val="0"/>
           <w:color w:val="434343"/>
         </w:rPr>
-        <w:t xml:space="preserve">文档日期：2026-09-12</w:t>
-      </w:r>
-      <w:r>
-        <w:rPr>
-          <w:rFonts w:ascii="Helvetica Neue" w:hAnsi="Helvetica Neue" w:cs="Helvetica Neue"/>
+        <w:t xml:space="preserve">文档日期：2026-09-12 当前 LegalMCQ Prompt：</w:t>
+      </w:r>
+      <w:r>
+        <w:rPr>
+          <w:rFonts w:ascii="Menlo" w:hAnsi="Menlo" w:cs="Menlo"/>
           <w:sz w:val="24"/>
           <w:sz-cs w:val="24"/>
           <w:spacing w:val="0"/>
           <w:color w:val="434343"/>
         </w:rPr>
-        <w:t xml:space="preserve"/>
-        <w:br/>
-        <w:t xml:space="preserve"/>
+        <w:t xml:space="preserve">legal-mcq-three-role-v5</w:t>
       </w:r>
       <w:r>
         <w:rPr>
@@ -52,7 +50,7 @@
           <w:spacing w:val="0"/>
           <w:color w:val="434343"/>
         </w:rPr>
-        <w:t xml:space="preserve">当前 LegalMCQ Prompt：</w:t>
+        <w:t xml:space="preserve"> 当前冻结 ID：</w:t>
       </w:r>
       <w:r>
         <w:rPr>
@@ -62,7 +60,7 @@
           <w:spacing w:val="0"/>
           <w:color w:val="434343"/>
         </w:rPr>
-        <w:t xml:space="preserve">legal-mcq-three-role-v5</w:t>
+        <w:t xml:space="preserve">d3175602655a56632c3d1bb3</w:t>
       </w:r>
       <w:r>
         <w:rPr>
@@ -72,83 +70,27 @@
           <w:spacing w:val="0"/>
           <w:color w:val="434343"/>
         </w:rPr>
-        <w:t xml:space="preserve"/>
-        <w:br/>
-        <w:t xml:space="preserve"/>
-      </w:r>
-      <w:r>
-        <w:rPr>
-          <w:rFonts w:ascii="Helvetica Neue" w:hAnsi="Helvetica Neue" w:cs="Helvetica Neue"/>
+        <w:t xml:space="preserve"> 当前离线回归：</w:t>
+      </w:r>
+      <w:r>
+        <w:rPr>
+          <w:rFonts w:ascii="Menlo" w:hAnsi="Menlo" w:cs="Menlo"/>
           <w:sz w:val="24"/>
           <w:sz-cs w:val="24"/>
           <w:spacing w:val="0"/>
           <w:color w:val="434343"/>
         </w:rPr>
-        <w:t xml:space="preserve">当前冻结 ID：</w:t>
-      </w:r>
-      <w:r>
-        <w:rPr>
-          <w:rFonts w:ascii="Menlo" w:hAnsi="Menlo" w:cs="Menlo"/>
+        <w:t xml:space="preserve">321 passed</w:t>
+      </w:r>
+      <w:r>
+        <w:rPr>
+          <w:rFonts w:ascii="Helvetica Neue" w:hAnsi="Helvetica Neue" w:cs="Helvetica Neue"/>
           <w:sz w:val="24"/>
           <w:sz-cs w:val="24"/>
           <w:spacing w:val="0"/>
           <w:color w:val="434343"/>
         </w:rPr>
-        <w:t xml:space="preserve">1931b3df9f45caf8f1c3ddc8</w:t>
-      </w:r>
-      <w:r>
-        <w:rPr>
-          <w:rFonts w:ascii="Helvetica Neue" w:hAnsi="Helvetica Neue" w:cs="Helvetica Neue"/>
-          <w:sz w:val="24"/>
-          <w:sz-cs w:val="24"/>
-          <w:spacing w:val="0"/>
-          <w:color w:val="434343"/>
-        </w:rPr>
-        <w:t xml:space="preserve"/>
-        <w:br/>
-        <w:t xml:space="preserve"/>
-      </w:r>
-      <w:r>
-        <w:rPr>
-          <w:rFonts w:ascii="Helvetica Neue" w:hAnsi="Helvetica Neue" w:cs="Helvetica Neue"/>
-          <w:sz w:val="24"/>
-          <w:sz-cs w:val="24"/>
-          <w:spacing w:val="0"/>
-          <w:color w:val="434343"/>
-        </w:rPr>
-        <w:t xml:space="preserve">当前离线回归：</w:t>
-      </w:r>
-      <w:r>
-        <w:rPr>
-          <w:rFonts w:ascii="Menlo" w:hAnsi="Menlo" w:cs="Menlo"/>
-          <w:sz w:val="24"/>
-          <w:sz-cs w:val="24"/>
-          <w:spacing w:val="0"/>
-          <w:color w:val="434343"/>
-        </w:rPr>
-        <w:t xml:space="preserve">321 passed</w:t>
-      </w:r>
-      <w:r>
-        <w:rPr>
-          <w:rFonts w:ascii="Helvetica Neue" w:hAnsi="Helvetica Neue" w:cs="Helvetica Neue"/>
-          <w:sz w:val="24"/>
-          <w:sz-cs w:val="24"/>
-          <w:spacing w:val="0"/>
-          <w:color w:val="434343"/>
-        </w:rPr>
-        <w:t xml:space="preserve"/>
-        <w:br/>
-        <w:t xml:space="preserve"/>
-      </w:r>
-      <w:r>
-        <w:rPr>
-          <w:rFonts w:ascii="Helvetica Neue" w:hAnsi="Helvetica Neue" w:cs="Helvetica Neue"/>
-          <w:sz w:val="24"/>
-          <w:sz-cs w:val="24"/>
-          <w:spacing w:val="0"/>
-          <w:color w:val="434343"/>
-        </w:rPr>
-        <w:t xml:space="preserve">项目定位：训练免费、可审计、可回滚的法律选择题多智能体推理系统</w:t>
+        <w:t xml:space="preserve"> 项目定位：训练免费、可审计、可回滚的法律选择题多智能体推理系统</w:t>
       </w:r>
       <w:r>
         <w:rPr>
@@ -17102,7 +17044,7 @@
           <w:spacing w:val="0"/>
           <w:color w:val="18191B"/>
         </w:rPr>
-        <w:t xml:space="preserve">controller_call_timeout_seconds: 30</w:t>
+        <w:t xml:space="preserve">controller_call_timeout_seconds: 60</w:t>
       </w:r>
     </w:p>
     <w:p>
@@ -22589,6 +22531,333 @@
     </w:p>
     <w:p>
       <w:pPr>
+        <w:spacing w:after="360"/>
+      </w:pPr>
+      <w:r>
+        <w:rPr>
+          <w:rFonts w:ascii="Helvetica Neue" w:hAnsi="Helvetica Neue" w:cs="Helvetica Neue"/>
+          <w:sz w:val="36"/>
+          <w:sz-cs w:val="36"/>
+          <w:b/>
+          <w:spacing w:val="0"/>
+          <w:color w:val="18191B"/>
+        </w:rPr>
+        <w:t xml:space="preserve">14.5 剩余独立 dev29 配对门控</w:t>
+      </w:r>
+    </w:p>
+    <w:p>
+      <w:pPr>
+        <w:spacing w:after="240"/>
+      </w:pPr>
+      <w:r>
+        <w:rPr>
+          <w:rFonts w:ascii="Helvetica Neue" w:hAnsi="Helvetica Neue" w:cs="Helvetica Neue"/>
+          <w:sz w:val="24"/>
+          <w:sz-cs w:val="24"/>
+          <w:spacing w:val="0"/>
+          <w:color w:val="18191B"/>
+        </w:rPr>
+        <w:t xml:space="preserve">在冻结 dev 中剩余全部 29 道未使用题上，比较 LegalMCQ v5 与同一个 GPT-5.6 Sol 的 Direct 单模型基线：</w:t>
+      </w:r>
+    </w:p>
+    <w:p>
+      <w:pPr>
+        <w:jc w:val="center"/>
+      </w:pPr>
+      <w:r>
+        <w:rPr>
+          <w:rFonts w:ascii="Helvetica Neue" w:hAnsi="Helvetica Neue" w:cs="Helvetica Neue"/>
+          <w:sz w:val="26"/>
+          <w:sz-cs w:val="26"/>
+          <w:b/>
+          <w:spacing w:val="0"/>
+          <w:color w:val="18191B"/>
+        </w:rPr>
+        <w:t xml:space="preserve">方法</w:t>
+      </w:r>
+    </w:p>
+    <w:p>
+      <w:pPr>
+        <w:jc w:val="right"/>
+      </w:pPr>
+      <w:r>
+        <w:rPr>
+          <w:rFonts w:ascii="Helvetica Neue" w:hAnsi="Helvetica Neue" w:cs="Helvetica Neue"/>
+          <w:sz w:val="26"/>
+          <w:sz-cs w:val="26"/>
+          <w:b/>
+          <w:spacing w:val="0"/>
+          <w:color w:val="18191B"/>
+        </w:rPr>
+        <w:t xml:space="preserve">正确率</w:t>
+      </w:r>
+    </w:p>
+    <w:p>
+      <w:pPr>
+        <w:jc w:val="right"/>
+      </w:pPr>
+      <w:r>
+        <w:rPr>
+          <w:rFonts w:ascii="Helvetica Neue" w:hAnsi="Helvetica Neue" w:cs="Helvetica Neue"/>
+          <w:sz w:val="26"/>
+          <w:sz-cs w:val="26"/>
+          <w:b/>
+          <w:spacing w:val="0"/>
+          <w:color w:val="18191B"/>
+        </w:rPr>
+        <w:t xml:space="preserve">返回率</w:t>
+      </w:r>
+    </w:p>
+    <w:p>
+      <w:pPr>
+        <w:jc w:val="right"/>
+      </w:pPr>
+      <w:r>
+        <w:rPr>
+          <w:rFonts w:ascii="Helvetica Neue" w:hAnsi="Helvetica Neue" w:cs="Helvetica Neue"/>
+          <w:sz w:val="26"/>
+          <w:sz-cs w:val="26"/>
+          <w:b/>
+          <w:spacing w:val="0"/>
+          <w:color w:val="18191B"/>
+        </w:rPr>
+        <w:t xml:space="preserve">Calls</w:t>
+      </w:r>
+    </w:p>
+    <w:p>
+      <w:pPr>
+        <w:jc w:val="right"/>
+      </w:pPr>
+      <w:r>
+        <w:rPr>
+          <w:rFonts w:ascii="Helvetica Neue" w:hAnsi="Helvetica Neue" w:cs="Helvetica Neue"/>
+          <w:sz w:val="26"/>
+          <w:sz-cs w:val="26"/>
+          <w:b/>
+          <w:spacing w:val="0"/>
+          <w:color w:val="18191B"/>
+        </w:rPr>
+        <w:t xml:space="preserve">Tokens</w:t>
+      </w:r>
+    </w:p>
+    <w:p>
+      <w:pPr/>
+      <w:r>
+        <w:rPr>
+          <w:rFonts w:ascii="Helvetica Neue" w:hAnsi="Helvetica Neue" w:cs="Helvetica Neue"/>
+          <w:sz w:val="26"/>
+          <w:sz-cs w:val="26"/>
+          <w:spacing w:val="0"/>
+          <w:color w:val="18191B"/>
+        </w:rPr>
+        <w:t xml:space="preserve">LegalMCQ v5</w:t>
+      </w:r>
+    </w:p>
+    <w:p>
+      <w:pPr>
+        <w:jc w:val="right"/>
+      </w:pPr>
+      <w:r>
+        <w:rPr>
+          <w:rFonts w:ascii="Helvetica Neue" w:hAnsi="Helvetica Neue" w:cs="Helvetica Neue"/>
+          <w:sz w:val="26"/>
+          <w:sz-cs w:val="26"/>
+          <w:spacing w:val="0"/>
+          <w:color w:val="18191B"/>
+        </w:rPr>
+        <w:t xml:space="preserve">18/29，62.07%</w:t>
+      </w:r>
+    </w:p>
+    <w:p>
+      <w:pPr>
+        <w:jc w:val="right"/>
+      </w:pPr>
+      <w:r>
+        <w:rPr>
+          <w:rFonts w:ascii="Helvetica Neue" w:hAnsi="Helvetica Neue" w:cs="Helvetica Neue"/>
+          <w:sz w:val="26"/>
+          <w:sz-cs w:val="26"/>
+          <w:spacing w:val="0"/>
+          <w:color w:val="18191B"/>
+        </w:rPr>
+        <w:t xml:space="preserve">29/29</w:t>
+      </w:r>
+    </w:p>
+    <w:p>
+      <w:pPr>
+        <w:jc w:val="right"/>
+      </w:pPr>
+      <w:r>
+        <w:rPr>
+          <w:rFonts w:ascii="Helvetica Neue" w:hAnsi="Helvetica Neue" w:cs="Helvetica Neue"/>
+          <w:sz w:val="26"/>
+          <w:sz-cs w:val="26"/>
+          <w:spacing w:val="0"/>
+          <w:color w:val="18191B"/>
+        </w:rPr>
+        <w:t xml:space="preserve">96</w:t>
+      </w:r>
+    </w:p>
+    <w:p>
+      <w:pPr>
+        <w:jc w:val="right"/>
+      </w:pPr>
+      <w:r>
+        <w:rPr>
+          <w:rFonts w:ascii="Helvetica Neue" w:hAnsi="Helvetica Neue" w:cs="Helvetica Neue"/>
+          <w:sz w:val="26"/>
+          <w:sz-cs w:val="26"/>
+          <w:spacing w:val="0"/>
+          <w:color w:val="18191B"/>
+        </w:rPr>
+        <w:t xml:space="preserve">219,026</w:t>
+      </w:r>
+    </w:p>
+    <w:p>
+      <w:pPr/>
+      <w:r>
+        <w:rPr>
+          <w:rFonts w:ascii="Helvetica Neue" w:hAnsi="Helvetica Neue" w:cs="Helvetica Neue"/>
+          <w:sz w:val="26"/>
+          <w:sz-cs w:val="26"/>
+          <w:spacing w:val="0"/>
+          <w:color w:val="18191B"/>
+        </w:rPr>
+        <w:t xml:space="preserve">Direct GPT-5.6 Sol</w:t>
+      </w:r>
+    </w:p>
+    <w:p>
+      <w:pPr>
+        <w:jc w:val="right"/>
+      </w:pPr>
+      <w:r>
+        <w:rPr>
+          <w:rFonts w:ascii="Helvetica Neue" w:hAnsi="Helvetica Neue" w:cs="Helvetica Neue"/>
+          <w:sz w:val="26"/>
+          <w:sz-cs w:val="26"/>
+          <w:spacing w:val="0"/>
+          <w:color w:val="18191B"/>
+        </w:rPr>
+        <w:t xml:space="preserve">19/29，65.52%</w:t>
+      </w:r>
+    </w:p>
+    <w:p>
+      <w:pPr>
+        <w:jc w:val="right"/>
+      </w:pPr>
+      <w:r>
+        <w:rPr>
+          <w:rFonts w:ascii="Helvetica Neue" w:hAnsi="Helvetica Neue" w:cs="Helvetica Neue"/>
+          <w:sz w:val="26"/>
+          <w:sz-cs w:val="26"/>
+          <w:spacing w:val="0"/>
+          <w:color w:val="18191B"/>
+        </w:rPr>
+        <w:t xml:space="preserve">29/29</w:t>
+      </w:r>
+    </w:p>
+    <w:p>
+      <w:pPr>
+        <w:jc w:val="right"/>
+      </w:pPr>
+      <w:r>
+        <w:rPr>
+          <w:rFonts w:ascii="Helvetica Neue" w:hAnsi="Helvetica Neue" w:cs="Helvetica Neue"/>
+          <w:sz w:val="26"/>
+          <w:sz-cs w:val="26"/>
+          <w:spacing w:val="0"/>
+          <w:color w:val="18191B"/>
+        </w:rPr>
+        <w:t xml:space="preserve">29</w:t>
+      </w:r>
+    </w:p>
+    <w:p>
+      <w:pPr>
+        <w:jc w:val="right"/>
+      </w:pPr>
+      <w:r>
+        <w:rPr>
+          <w:rFonts w:ascii="Helvetica Neue" w:hAnsi="Helvetica Neue" w:cs="Helvetica Neue"/>
+          <w:sz w:val="26"/>
+          <w:sz-cs w:val="26"/>
+          <w:spacing w:val="0"/>
+          <w:color w:val="18191B"/>
+        </w:rPr>
+        <w:t xml:space="preserve">24,395</w:t>
+      </w:r>
+    </w:p>
+    <w:p>
+      <w:pPr>
+        <w:spacing w:after="240"/>
+      </w:pPr>
+      <w:r>
+        <w:rPr>
+          <w:rFonts w:ascii="Helvetica Neue" w:hAnsi="Helvetica Neue" w:cs="Helvetica Neue"/>
+          <w:sz w:val="24"/>
+          <w:sz-cs w:val="24"/>
+          <w:spacing w:val="0"/>
+          <w:color w:val="18191B"/>
+        </w:rPr>
+        <w:t xml:space="preserve">配对结果为两者都正确 18 题、两者都错误 10 题、LegalMCQ only 0 题、 Direct only 1 题；Exact McNemar </w:t>
+      </w:r>
+      <w:r>
+        <w:rPr>
+          <w:rFonts w:ascii="Menlo" w:hAnsi="Menlo" w:cs="Menlo"/>
+          <w:sz w:val="24"/>
+          <w:sz-cs w:val="24"/>
+          <w:spacing w:val="0"/>
+          <w:color w:val="18191B"/>
+        </w:rPr>
+        <w:t xml:space="preserve">p=1.0</w:t>
+      </w:r>
+      <w:r>
+        <w:rPr>
+          <w:rFonts w:ascii="Helvetica Neue" w:hAnsi="Helvetica Neue" w:cs="Helvetica Neue"/>
+          <w:sz w:val="24"/>
+          <w:sz-cs w:val="24"/>
+          <w:spacing w:val="0"/>
+          <w:color w:val="18191B"/>
+        </w:rPr>
+        <w:t xml:space="preserve">。LegalMCQ 的 4 次 Schema 故障 全部恢复，Controller 60 秒配置实现 29/29 成功，但额外约 9 倍 tokens 没有 换来 benchmark 准确率提升。</w:t>
+      </w:r>
+    </w:p>
+    <w:p>
+      <w:pPr>
+        <w:spacing w:after="240"/>
+      </w:pPr>
+      <w:r>
+        <w:rPr>
+          <w:rFonts w:ascii="Helvetica Neue" w:hAnsi="Helvetica Neue" w:cs="Helvetica Neue"/>
+          <w:sz w:val="24"/>
+          <w:sz-cs w:val="24"/>
+          <w:spacing w:val="0"/>
+          <w:color w:val="18191B"/>
+        </w:rPr>
+        <w:t xml:space="preserve">因此当前可以主张工程链路和可审计性有效，不能主张准确率创新有效。完整报告： </w:t>
+      </w:r>
+      <w:r>
+        <w:rPr>
+          <w:rFonts w:ascii="Menlo" w:hAnsi="Menlo" w:cs="Menlo"/>
+          <w:sz w:val="24"/>
+          <w:sz-cs w:val="24"/>
+          <w:spacing w:val="0"/>
+          <w:color w:val="18191B"/>
+        </w:rPr>
+        <w:t xml:space="preserve">docs/legal_mcq_effectiveness_gate_20260928.md</w:t>
+      </w:r>
+      <w:r>
+        <w:rPr>
+          <w:rFonts w:ascii="Helvetica Neue" w:hAnsi="Helvetica Neue" w:cs="Helvetica Neue"/>
+          <w:sz w:val="24"/>
+          <w:sz-cs w:val="24"/>
+          <w:spacing w:val="0"/>
+          <w:color w:val="18191B"/>
+        </w:rPr>
+        <w:t xml:space="preserve">。</w:t>
+      </w:r>
+    </w:p>
+    <w:p>
+      <w:pPr>
         <w:spacing w:after="381"/>
       </w:pPr>
       <w:r>
@@ -22765,7 +23034,7 @@
           <w:spacing w:val="0"/>
           <w:color w:val="18191B"/>
         </w:rPr>
-        <w:t xml:space="preserve">  controller_call_timeout_seconds: 30</w:t>
+        <w:t xml:space="preserve">  controller_call_timeout_seconds: 60</w:t>
       </w:r>
     </w:p>
     <w:p>
@@ -23530,9 +23799,7 @@
           <w:spacing w:val="0"/>
           <w:color w:val="18191B"/>
         </w:rPr>
-        <w:t xml:space="preserve">。</w:t>
-        <w:br/>
-        <w:t xml:space="preserve">恢复旧核验顺序：设置 </w:t>
+        <w:t xml:space="preserve">。 恢复旧核验顺序：设置 </w:t>
       </w:r>
       <w:r>
         <w:rPr>
@@ -23552,9 +23819,7 @@
           <w:spacing w:val="0"/>
           <w:color w:val="18191B"/>
         </w:rPr>
-        <w:t xml:space="preserve">。</w:t>
-        <w:br/>
-        <w:t xml:space="preserve">关闭 Web、C-LEX、OATH、CAPE：保持各模块 </w:t>
+        <w:t xml:space="preserve">。 关闭 Web、C-LEX、OATH、CAPE：保持各模块 </w:t>
       </w:r>
       <w:r>
         <w:rPr>

</xml_diff>